<commit_message>
docs(guide): list sorting/filtering, timestamps, calendar picker, §9.2.2 intensity levels
New §9.1.1 (sorting/filtering record lists) and §9.2.2 (Maximum intensity
explained — the four ceiling levels with what each permits); updated the
engagements-list columns, the test-window picking steps, the Details card
fields, and the Change password section wording. Docx rebuilt.

Co-Authored-By: Claude Fable 5 <noreply@anthropic.com>
</commit_message>
<xml_diff>
--- a/docs/DAS_Sentinel_User_Guide.docx
+++ b/docs/DAS_Sentinel_User_Guide.docx
@@ -5243,16 +5243,25 @@
         <w:t>Profile</w:t>
       </w:r>
       <w:r>
-        <w:t xml:space="preserve"> (Name, Email, Phone number) and </w:t>
+        <w:t xml:space="preserve"> (Name, Email, Phone number) and a collapsed </w:t>
       </w:r>
       <w:r>
         <w:rPr>
           <w:b/>
         </w:rPr>
-        <w:t>Password</w:t>
-      </w:r>
-      <w:r>
-        <w:t xml:space="preserve"> (Current, New, Confirm).</w:t>
+        <w:t>Change password</w:t>
+      </w:r>
+      <w:r>
+        <w:t xml:space="preserve"> section — click the </w:t>
+      </w:r>
+      <w:r>
+        <w:rPr>
+          <w:i/>
+        </w:rPr>
+        <w:t>Change password</w:t>
+      </w:r>
+      <w:r>
+        <w:t xml:space="preserve"> label to expand the Current / New / Confirm fields.</w:t>
       </w:r>
     </w:p>
     <w:p>
@@ -5447,16 +5456,16 @@
     </w:p>
     <w:p>
       <w:r>
-        <w:t xml:space="preserve">In the </w:t>
+        <w:t xml:space="preserve">Expand the </w:t>
       </w:r>
       <w:r>
         <w:rPr>
           <w:b/>
         </w:rPr>
-        <w:t>Password</w:t>
-      </w:r>
-      <w:r>
-        <w:t xml:space="preserve"> card enter your current password, the new password twice, and save. The failure messages are specific:</w:t>
+        <w:t>Change password</w:t>
+      </w:r>
+      <w:r>
+        <w:t xml:space="preserve"> section, enter your current password, the new password twice, and save. The failure messages are specific:</w:t>
       </w:r>
     </w:p>
     <w:tbl>
@@ -6663,7 +6672,34 @@
         <w:t>n rps</w:t>
       </w:r>
       <w:r>
-        <w:t xml:space="preserve">). Newest first. With none yet you get a dashed </w:t>
+        <w:t xml:space="preserve">), </w:t>
+      </w:r>
+      <w:r>
+        <w:rPr>
+          <w:b/>
+        </w:rPr>
+        <w:t>Created</w:t>
+      </w:r>
+      <w:r>
+        <w:t xml:space="preserve">, </w:t>
+      </w:r>
+      <w:r>
+        <w:rPr>
+          <w:b/>
+        </w:rPr>
+        <w:t>Updated</w:t>
+      </w:r>
+      <w:r>
+        <w:t xml:space="preserve">, and </w:t>
+      </w:r>
+      <w:r>
+        <w:rPr>
+          <w:b/>
+        </w:rPr>
+        <w:t>Closed</w:t>
+      </w:r>
+      <w:r>
+        <w:t xml:space="preserve"> (— until the engagement is closed; then the close timestamp). Newest first. With none yet you get a dashed </w:t>
       </w:r>
       <w:r>
         <w:rPr>
@@ -6686,6 +6722,52 @@
     </w:p>
     <w:p>
       <w:pPr>
+        <w:pStyle w:val="Heading3"/>
+      </w:pPr>
+      <w:r>
+        <w:t>9.1.1  Sorting and filtering record lists</w:t>
+      </w:r>
+    </w:p>
+    <w:p>
+      <w:r>
+        <w:t xml:space="preserve">Every record list (Engagements, Targets, Findings, Audit log) sorts and filters the way a ServiceNow list does. </w:t>
+      </w:r>
+      <w:r>
+        <w:rPr>
+          <w:b/>
+        </w:rPr>
+        <w:t>Click a column header</w:t>
+      </w:r>
+      <w:r>
+        <w:t xml:space="preserve"> to sort ascending (▲); click again for descending (▼); a third click restores the default order. *</w:t>
+      </w:r>
+      <w:r>
+        <w:rPr>
+          <w:i/>
+        </w:rPr>
+        <w:t xml:space="preserve">The row of </w:t>
+      </w:r>
+      <w:r>
+        <w:t>Search</w:t>
+      </w:r>
+      <w:r>
+        <w:rPr>
+          <w:i/>
+        </w:rPr>
+        <w:t xml:space="preserve"> boxes under the headers</w:t>
+      </w:r>
+      <w:r>
+        <w:rPr>
+          <w:i/>
+        </w:rPr>
+        <w:t xml:space="preserve"> filters per column — case-insensitive substring match, and multiple boxes combine (a row must match all of them). Filtering and sorting are instant and purely visual: they never change the records themselves. With every matching row filtered out the list shows </w:t>
+      </w:r>
+      <w:r>
+        <w:t>No records match the filters.*</w:t>
+      </w:r>
+    </w:p>
+    <w:p>
+      <w:pPr>
         <w:pStyle w:val="Heading2"/>
       </w:pPr>
       <w:r>
@@ -6758,7 +6840,16 @@
         <w:t>Test window end</w:t>
       </w:r>
       <w:r>
-        <w:t>. See the warning below.</w:t>
+        <w:t xml:space="preserve">: click the field to open its calendar, pick the day, set the time, and click </w:t>
+      </w:r>
+      <w:r>
+        <w:rPr>
+          <w:b/>
+        </w:rPr>
+        <w:t>Apply</w:t>
+      </w:r>
+      <w:r>
+        <w:t xml:space="preserve"> inside the popup. The field then shows the chosen value; click it again to change or clear it. See the warning below.</w:t>
       </w:r>
     </w:p>
     <w:p>
@@ -7386,7 +7477,7 @@
               <w:rPr>
                 <w:sz w:val="17"/>
               </w:rPr>
-              <w:t>. A launch above this is refused.</w:t>
+              <w:t>. A launch above this is refused. Hover the ⓘ next to the label, or see §9.2.2, for what each level permits.</w:t>
             </w:r>
           </w:p>
         </w:tc>
@@ -7744,6 +7835,423 @@
     </w:p>
     <w:p>
       <w:pPr>
+        <w:pStyle w:val="Heading3"/>
+      </w:pPr>
+      <w:r>
+        <w:t>9.2.2  Maximum intensity explained</w:t>
+      </w:r>
+    </w:p>
+    <w:p>
+      <w:r>
+        <w:rPr>
+          <w:b/>
+        </w:rPr>
+        <w:t>Maximum intensity is the safety ceiling for the whole engagement</w:t>
+      </w:r>
+      <w:r>
+        <w:t xml:space="preserve"> — the most aggressive kind of testing any scan under it is allowed to perform. It is not a per-scan setting and not a speed control (that is the rate limit). Every launch derives its </w:t>
+      </w:r>
+      <w:r>
+        <w:rPr>
+          <w:i/>
+        </w:rPr>
+        <w:t>effective</w:t>
+      </w:r>
+      <w:r>
+        <w:t xml:space="preserve"> intensity </w:t>
+      </w:r>
+      <w:r>
+        <w:rPr>
+          <w:b/>
+        </w:rPr>
+        <w:t>server-side from what the operation actually does</w:t>
+      </w:r>
+      <w:r>
+        <w:t xml:space="preserve"> — a caller cannot declare a lower intensity to smuggle a riskier action through — and the launch is refused with </w:t>
+      </w:r>
+      <w:r>
+        <w:rPr>
+          <w:rFonts w:ascii="Consolas" w:hAnsi="Consolas"/>
+          <w:sz w:val="19"/>
+        </w:rPr>
+        <w:t>intensity_not_authorized</w:t>
+      </w:r>
+      <w:r>
+        <w:t xml:space="preserve"> when the derived intensity exceeds this ceiling. The four levels, lowest to highest:</w:t>
+      </w:r>
+    </w:p>
+    <w:tbl>
+      <w:tblPr>
+        <w:tblStyle w:val="LightGrid-Accent1"/>
+        <w:tblW w:type="auto" w:w="0"/>
+        <w:jc w:val="center"/>
+        <w:tblLayout w:type="fixed"/>
+        <w:tblLook w:firstColumn="1" w:firstRow="1" w:lastColumn="0" w:lastRow="0" w:noHBand="0" w:noVBand="1" w:val="04A0"/>
+      </w:tblPr>
+      <w:tblGrid>
+        <w:gridCol w:w="3216"/>
+        <w:gridCol w:w="3216"/>
+        <w:gridCol w:w="3216"/>
+      </w:tblGrid>
+      <w:tr>
+        <w:tc>
+          <w:tcPr>
+            <w:tcW w:type="dxa" w:w="1872"/>
+          </w:tcPr>
+          <w:p>
+            <w:pPr>
+              <w:spacing w:after="40"/>
+            </w:pPr>
+            <w:r>
+              <w:rPr>
+                <w:sz w:val="17"/>
+              </w:rPr>
+            </w:r>
+            <w:r>
+              <w:rPr>
+                <w:b/>
+                <w:sz w:val="17"/>
+              </w:rPr>
+              <w:t>Level</w:t>
+            </w:r>
+          </w:p>
+        </w:tc>
+        <w:tc>
+          <w:tcPr>
+            <w:tcW w:type="dxa" w:w="3888"/>
+          </w:tcPr>
+          <w:p>
+            <w:pPr>
+              <w:spacing w:after="40"/>
+            </w:pPr>
+            <w:r>
+              <w:rPr>
+                <w:sz w:val="17"/>
+              </w:rPr>
+            </w:r>
+            <w:r>
+              <w:rPr>
+                <w:b/>
+                <w:sz w:val="17"/>
+              </w:rPr>
+              <w:t>What it permits</w:t>
+            </w:r>
+          </w:p>
+        </w:tc>
+        <w:tc>
+          <w:tcPr>
+            <w:tcW w:type="dxa" w:w="3744"/>
+          </w:tcPr>
+          <w:p>
+            <w:pPr>
+              <w:spacing w:after="40"/>
+            </w:pPr>
+            <w:r>
+              <w:rPr>
+                <w:sz w:val="17"/>
+              </w:rPr>
+            </w:r>
+            <w:r>
+              <w:rPr>
+                <w:b/>
+                <w:sz w:val="17"/>
+              </w:rPr>
+              <w:t>Example operations</w:t>
+            </w:r>
+          </w:p>
+        </w:tc>
+      </w:tr>
+      <w:tr>
+        <w:tc>
+          <w:tcPr>
+            <w:tcW w:type="dxa" w:w="1872"/>
+          </w:tcPr>
+          <w:p>
+            <w:pPr>
+              <w:spacing w:after="40"/>
+            </w:pPr>
+            <w:r>
+              <w:rPr>
+                <w:sz w:val="17"/>
+              </w:rPr>
+            </w:r>
+            <w:r>
+              <w:rPr>
+                <w:sz w:val="17"/>
+              </w:rPr>
+              <w:t>Passive</w:t>
+            </w:r>
+          </w:p>
+        </w:tc>
+        <w:tc>
+          <w:tcPr>
+            <w:tcW w:type="dxa" w:w="3888"/>
+          </w:tcPr>
+          <w:p>
+            <w:pPr>
+              <w:spacing w:after="40"/>
+            </w:pPr>
+            <w:r>
+              <w:rPr>
+                <w:sz w:val="17"/>
+              </w:rPr>
+            </w:r>
+            <w:r>
+              <w:rPr>
+                <w:sz w:val="17"/>
+              </w:rPr>
+              <w:t>Observation only. Nothing is sent that could change or stress the target.</w:t>
+            </w:r>
+          </w:p>
+        </w:tc>
+        <w:tc>
+          <w:tcPr>
+            <w:tcW w:type="dxa" w:w="3744"/>
+          </w:tcPr>
+          <w:p>
+            <w:pPr>
+              <w:spacing w:after="40"/>
+            </w:pPr>
+            <w:r>
+              <w:rPr>
+                <w:sz w:val="17"/>
+              </w:rPr>
+            </w:r>
+            <w:r>
+              <w:rPr>
+                <w:sz w:val="17"/>
+              </w:rPr>
+              <w:t>Passive reconnaissance.</w:t>
+            </w:r>
+          </w:p>
+        </w:tc>
+      </w:tr>
+      <w:tr>
+        <w:tc>
+          <w:tcPr>
+            <w:tcW w:type="dxa" w:w="1872"/>
+          </w:tcPr>
+          <w:p>
+            <w:pPr>
+              <w:spacing w:after="40"/>
+            </w:pPr>
+            <w:r>
+              <w:rPr>
+                <w:sz w:val="17"/>
+              </w:rPr>
+            </w:r>
+            <w:r>
+              <w:rPr>
+                <w:sz w:val="17"/>
+              </w:rPr>
+              <w:t>Safe active</w:t>
+            </w:r>
+          </w:p>
+        </w:tc>
+        <w:tc>
+          <w:tcPr>
+            <w:tcW w:type="dxa" w:w="3888"/>
+          </w:tcPr>
+          <w:p>
+            <w:pPr>
+              <w:spacing w:after="40"/>
+            </w:pPr>
+            <w:r>
+              <w:rPr>
+                <w:sz w:val="17"/>
+              </w:rPr>
+            </w:r>
+            <w:r>
+              <w:rPr>
+                <w:sz w:val="17"/>
+              </w:rPr>
+              <w:t>The default. Non-destructive active testing: the target is probed with safe payloads, without credentials.</w:t>
+            </w:r>
+          </w:p>
+        </w:tc>
+        <w:tc>
+          <w:tcPr>
+            <w:tcW w:type="dxa" w:w="3744"/>
+          </w:tcPr>
+          <w:p>
+            <w:pPr>
+              <w:spacing w:after="40"/>
+            </w:pPr>
+            <w:r>
+              <w:rPr>
+                <w:sz w:val="17"/>
+              </w:rPr>
+            </w:r>
+            <w:r>
+              <w:rPr>
+                <w:sz w:val="17"/>
+              </w:rPr>
+              <w:t>Unauthenticated web/API scans, AI/LLM test suites, SAST.</w:t>
+            </w:r>
+          </w:p>
+        </w:tc>
+      </w:tr>
+      <w:tr>
+        <w:tc>
+          <w:tcPr>
+            <w:tcW w:type="dxa" w:w="1872"/>
+          </w:tcPr>
+          <w:p>
+            <w:pPr>
+              <w:spacing w:after="40"/>
+            </w:pPr>
+            <w:r>
+              <w:rPr>
+                <w:sz w:val="17"/>
+              </w:rPr>
+            </w:r>
+            <w:r>
+              <w:rPr>
+                <w:sz w:val="17"/>
+              </w:rPr>
+              <w:t>Authenticated active</w:t>
+            </w:r>
+          </w:p>
+        </w:tc>
+        <w:tc>
+          <w:tcPr>
+            <w:tcW w:type="dxa" w:w="3888"/>
+          </w:tcPr>
+          <w:p>
+            <w:pPr>
+              <w:spacing w:after="40"/>
+            </w:pPr>
+            <w:r>
+              <w:rPr>
+                <w:sz w:val="17"/>
+              </w:rPr>
+            </w:r>
+            <w:r>
+              <w:rPr>
+                <w:sz w:val="17"/>
+              </w:rPr>
+              <w:t>Everything in Safe active, plus scans that sign in to the target with the credentials configured on it.</w:t>
+            </w:r>
+          </w:p>
+        </w:tc>
+        <w:tc>
+          <w:tcPr>
+            <w:tcW w:type="dxa" w:w="3744"/>
+          </w:tcPr>
+          <w:p>
+            <w:pPr>
+              <w:spacing w:after="40"/>
+            </w:pPr>
+            <w:r>
+              <w:rPr>
+                <w:sz w:val="17"/>
+              </w:rPr>
+            </w:r>
+            <w:r>
+              <w:rPr>
+                <w:sz w:val="17"/>
+              </w:rPr>
+              <w:t>Authenticated ZAP scans behind a login.</w:t>
+            </w:r>
+          </w:p>
+        </w:tc>
+      </w:tr>
+      <w:tr>
+        <w:tc>
+          <w:tcPr>
+            <w:tcW w:type="dxa" w:w="1872"/>
+          </w:tcPr>
+          <w:p>
+            <w:pPr>
+              <w:spacing w:after="40"/>
+            </w:pPr>
+            <w:r>
+              <w:rPr>
+                <w:sz w:val="17"/>
+              </w:rPr>
+            </w:r>
+            <w:r>
+              <w:rPr>
+                <w:sz w:val="17"/>
+              </w:rPr>
+              <w:t>High risk</w:t>
+            </w:r>
+          </w:p>
+        </w:tc>
+        <w:tc>
+          <w:tcPr>
+            <w:tcW w:type="dxa" w:w="3888"/>
+          </w:tcPr>
+          <w:p>
+            <w:pPr>
+              <w:spacing w:after="40"/>
+            </w:pPr>
+            <w:r>
+              <w:rPr>
+                <w:sz w:val="17"/>
+              </w:rPr>
+            </w:r>
+            <w:r>
+              <w:rPr>
+                <w:sz w:val="17"/>
+              </w:rPr>
+              <w:t>The full set — potentially disruptive operations. Each high-risk run additionally requires its own single-use approval (§14); the ceiling alone is not enough.</w:t>
+            </w:r>
+          </w:p>
+        </w:tc>
+        <w:tc>
+          <w:tcPr>
+            <w:tcW w:type="dxa" w:w="3744"/>
+          </w:tcPr>
+          <w:p>
+            <w:pPr>
+              <w:spacing w:after="40"/>
+            </w:pPr>
+            <w:r>
+              <w:rPr>
+                <w:sz w:val="17"/>
+              </w:rPr>
+            </w:r>
+            <w:r>
+              <w:rPr>
+                <w:sz w:val="17"/>
+              </w:rPr>
+              <w:t>Exploit validation, brute force, large-scale crawls, data-modifying payloads.</w:t>
+            </w:r>
+          </w:p>
+        </w:tc>
+      </w:tr>
+    </w:tbl>
+    <w:p>
+      <w:pPr>
+        <w:spacing w:after="40"/>
+      </w:pPr>
+    </w:p>
+    <w:p>
+      <w:r>
+        <w:t xml:space="preserve">Pick the lowest ceiling the engagement's ROE actually authorizes. In the form, hovering the small </w:t>
+      </w:r>
+      <w:r>
+        <w:rPr>
+          <w:b/>
+        </w:rPr>
+        <w:t>ⓘ</w:t>
+      </w:r>
+      <w:r>
+        <w:t xml:space="preserve"> next to the </w:t>
+      </w:r>
+      <w:r>
+        <w:rPr>
+          <w:i/>
+        </w:rPr>
+        <w:t>Maximum intensity</w:t>
+      </w:r>
+      <w:r>
+        <w:t xml:space="preserve"> label shows this same summary. Remember that raising or lowering the ceiling later invalidates the ROE acknowledgement (§9.4).</w:t>
+      </w:r>
+    </w:p>
+    <w:p>
+      <w:pPr>
         <w:pStyle w:val="Heading2"/>
       </w:pPr>
       <w:r>
@@ -7775,7 +8283,16 @@
         <w:t>—</w:t>
       </w:r>
       <w:r>
-        <w:t>), Rate limit, Maximum intensity, Hosted LLMs, both contacts, Created and Updated timestamps.</w:t>
+        <w:t xml:space="preserve">), Rate limit, Maximum intensity, Hosted LLMs, both contacts, Created, Updated, and Closed timestamps (Closed is </w:t>
+      </w:r>
+      <w:r>
+        <w:rPr>
+          <w:i/>
+        </w:rPr>
+        <w:t>—</w:t>
+      </w:r>
+      <w:r>
+        <w:t xml:space="preserve"> until the engagement is closed).</w:t>
       </w:r>
     </w:p>
     <w:p>

</xml_diff>